<commit_message>
Updated final project and calendar
</commit_message>
<xml_diff>
--- a/projects/Final-Project-Hints.docx
+++ b/projects/Final-Project-Hints.docx
@@ -51,15 +51,127 @@
           <w:u w:val="single"/>
           <w:shd w:val="clear" w:color="auto" w:fill="FFFFFF"/>
         </w:rPr>
-        <w:t>To earn a C grade:</w:t>
+        <w:t>Main Hardening Tasks:</w:t>
       </w:r>
     </w:p>
     <w:p>
       <w:pPr>
-        <w:pStyle w:val="ListParagraph"/>
+        <w:rPr>
+          <w:rFonts w:ascii="Open Sans" w:hAnsi="Open Sans" w:cs="Open Sans"/>
+          <w:b/>
+          <w:bCs/>
+          <w:i/>
+          <w:iCs/>
+          <w:color w:val="000000"/>
+          <w:sz w:val="20"/>
+          <w:szCs w:val="20"/>
+          <w:shd w:val="clear" w:color="auto" w:fill="FFFFFF"/>
+        </w:rPr>
+      </w:pPr>
+      <w:r>
+        <w:rPr>
+          <w:rFonts w:ascii="Open Sans" w:hAnsi="Open Sans" w:cs="Open Sans"/>
+          <w:b/>
+          <w:bCs/>
+          <w:i/>
+          <w:iCs/>
+          <w:color w:val="000000"/>
+          <w:sz w:val="20"/>
+          <w:szCs w:val="20"/>
+          <w:shd w:val="clear" w:color="auto" w:fill="FFFFFF"/>
+        </w:rPr>
+        <w:t>To earn a C grade</w:t>
+      </w:r>
+      <w:r>
+        <w:rPr>
+          <w:rFonts w:ascii="Open Sans" w:hAnsi="Open Sans" w:cs="Open Sans"/>
+          <w:b/>
+          <w:bCs/>
+          <w:i/>
+          <w:iCs/>
+          <w:color w:val="000000"/>
+          <w:sz w:val="20"/>
+          <w:szCs w:val="20"/>
+          <w:shd w:val="clear" w:color="auto" w:fill="FFFFFF"/>
+        </w:rPr>
+        <w:t xml:space="preserve">, do 3 </w:t>
+      </w:r>
+      <w:r>
+        <w:rPr>
+          <w:rFonts w:ascii="Open Sans" w:hAnsi="Open Sans" w:cs="Open Sans"/>
+          <w:b/>
+          <w:bCs/>
+          <w:i/>
+          <w:iCs/>
+          <w:color w:val="000000"/>
+          <w:sz w:val="20"/>
+          <w:szCs w:val="20"/>
+          <w:shd w:val="clear" w:color="auto" w:fill="FFFFFF"/>
+        </w:rPr>
+        <w:t xml:space="preserve">tasks </w:t>
+      </w:r>
+      <w:r>
+        <w:rPr>
+          <w:rFonts w:ascii="Open Sans" w:hAnsi="Open Sans" w:cs="Open Sans"/>
+          <w:b/>
+          <w:bCs/>
+          <w:i/>
+          <w:iCs/>
+          <w:color w:val="000000"/>
+          <w:sz w:val="20"/>
+          <w:szCs w:val="20"/>
+          <w:shd w:val="clear" w:color="auto" w:fill="FFFFFF"/>
+        </w:rPr>
+        <w:t xml:space="preserve">out of the </w:t>
+      </w:r>
+      <w:r>
+        <w:rPr>
+          <w:rFonts w:ascii="Open Sans" w:hAnsi="Open Sans" w:cs="Open Sans"/>
+          <w:b/>
+          <w:bCs/>
+          <w:i/>
+          <w:iCs/>
+          <w:color w:val="000000"/>
+          <w:sz w:val="20"/>
+          <w:szCs w:val="20"/>
+          <w:shd w:val="clear" w:color="auto" w:fill="FFFFFF"/>
+        </w:rPr>
+        <w:t xml:space="preserve">following </w:t>
+      </w:r>
+      <w:r>
+        <w:rPr>
+          <w:rFonts w:ascii="Open Sans" w:hAnsi="Open Sans" w:cs="Open Sans"/>
+          <w:b/>
+          <w:bCs/>
+          <w:i/>
+          <w:iCs/>
+          <w:color w:val="000000"/>
+          <w:sz w:val="20"/>
+          <w:szCs w:val="20"/>
+          <w:shd w:val="clear" w:color="auto" w:fill="FFFFFF"/>
+        </w:rPr>
+        <w:t>4</w:t>
+      </w:r>
+      <w:r>
+        <w:rPr>
+          <w:rFonts w:ascii="Open Sans" w:hAnsi="Open Sans" w:cs="Open Sans"/>
+          <w:b/>
+          <w:bCs/>
+          <w:i/>
+          <w:iCs/>
+          <w:color w:val="000000"/>
+          <w:sz w:val="20"/>
+          <w:szCs w:val="20"/>
+          <w:shd w:val="clear" w:color="auto" w:fill="FFFFFF"/>
+        </w:rPr>
+        <w:t xml:space="preserve"> listed below.</w:t>
+      </w:r>
+    </w:p>
+    <w:p>
+      <w:pPr>
         <w:numPr>
           <w:ilvl w:val="0"/>
-          <w:numId w:val="4"/>
+          <w:numId w:val="5"/>
         </w:numPr>
         <w:rPr>
           <w:rFonts w:ascii="Open Sans" w:hAnsi="Open Sans" w:cs="Open Sans"/>
@@ -72,20 +184,55 @@
       <w:r>
         <w:rPr>
           <w:rFonts w:ascii="Open Sans" w:hAnsi="Open Sans" w:cs="Open Sans"/>
-          <w:color w:val="000000"/>
-          <w:sz w:val="20"/>
-          <w:szCs w:val="20"/>
-          <w:shd w:val="clear" w:color="auto" w:fill="FFFFFF"/>
-        </w:rPr>
-        <w:t>Configure and enable modsecurity</w:t>
+          <w:b/>
+          <w:bCs/>
+          <w:color w:val="000000"/>
+          <w:sz w:val="20"/>
+          <w:szCs w:val="20"/>
+          <w:shd w:val="clear" w:color="auto" w:fill="FFFFFF"/>
+        </w:rPr>
+        <w:t>Firewall</w:t>
+      </w:r>
+      <w:r>
+        <w:rPr>
+          <w:rFonts w:ascii="Open Sans" w:hAnsi="Open Sans" w:cs="Open Sans"/>
+          <w:b/>
+          <w:bCs/>
+          <w:color w:val="000000"/>
+          <w:sz w:val="20"/>
+          <w:szCs w:val="20"/>
+          <w:shd w:val="clear" w:color="auto" w:fill="FFFFFF"/>
+        </w:rPr>
+        <w:t>s</w:t>
+      </w:r>
+      <w:r>
+        <w:rPr>
+          <w:rFonts w:ascii="Open Sans" w:hAnsi="Open Sans" w:cs="Open Sans"/>
+          <w:b/>
+          <w:bCs/>
+          <w:color w:val="000000"/>
+          <w:sz w:val="20"/>
+          <w:szCs w:val="20"/>
+          <w:shd w:val="clear" w:color="auto" w:fill="FFFFFF"/>
+        </w:rPr>
+        <w:t>:</w:t>
+      </w:r>
+      <w:r>
+        <w:rPr>
+          <w:rFonts w:ascii="Open Sans" w:hAnsi="Open Sans" w:cs="Open Sans"/>
+          <w:color w:val="000000"/>
+          <w:sz w:val="20"/>
+          <w:szCs w:val="20"/>
+          <w:shd w:val="clear" w:color="auto" w:fill="FFFFFF"/>
+        </w:rPr>
+        <w:t xml:space="preserve"> Install and configure ModSecurity WAF to detect and block SQL injection and XSS attempts (enable what makes sense in the Core Rule Set) and install a local firewall (something like UFW while just allowing access to necessary ports such as ssh and http.)</w:t>
       </w:r>
     </w:p>
     <w:p>
       <w:pPr>
-        <w:pStyle w:val="ListParagraph"/>
         <w:numPr>
           <w:ilvl w:val="0"/>
-          <w:numId w:val="4"/>
+          <w:numId w:val="5"/>
         </w:numPr>
         <w:rPr>
           <w:rFonts w:ascii="Open Sans" w:hAnsi="Open Sans" w:cs="Open Sans"/>
@@ -98,60 +245,31 @@
       <w:r>
         <w:rPr>
           <w:rFonts w:ascii="Open Sans" w:hAnsi="Open Sans" w:cs="Open Sans"/>
-          <w:color w:val="000000"/>
-          <w:sz w:val="20"/>
-          <w:szCs w:val="20"/>
-          <w:shd w:val="clear" w:color="auto" w:fill="FFFFFF"/>
-        </w:rPr>
-        <w:t xml:space="preserve">Update php </w:t>
-      </w:r>
-      <w:r>
-        <w:rPr>
-          <w:rFonts w:ascii="Open Sans" w:hAnsi="Open Sans" w:cs="Open Sans"/>
-          <w:color w:val="000000"/>
-          <w:sz w:val="20"/>
-          <w:szCs w:val="20"/>
-          <w:shd w:val="clear" w:color="auto" w:fill="FFFFFF"/>
-        </w:rPr>
-        <w:t>to 8.</w:t>
-      </w:r>
-      <w:r>
-        <w:rPr>
-          <w:rFonts w:ascii="Open Sans" w:hAnsi="Open Sans" w:cs="Open Sans"/>
-          <w:color w:val="000000"/>
-          <w:sz w:val="20"/>
-          <w:szCs w:val="20"/>
-          <w:shd w:val="clear" w:color="auto" w:fill="FFFFFF"/>
-        </w:rPr>
-        <w:t>1</w:t>
-      </w:r>
-      <w:r>
-        <w:rPr>
-          <w:rFonts w:ascii="Open Sans" w:hAnsi="Open Sans" w:cs="Open Sans"/>
-          <w:color w:val="000000"/>
-          <w:sz w:val="20"/>
-          <w:szCs w:val="20"/>
-          <w:shd w:val="clear" w:color="auto" w:fill="FFFFFF"/>
-        </w:rPr>
-        <w:t xml:space="preserve"> </w:t>
-      </w:r>
-      <w:r>
-        <w:rPr>
-          <w:rFonts w:ascii="Open Sans" w:hAnsi="Open Sans" w:cs="Open Sans"/>
-          <w:color w:val="000000"/>
-          <w:sz w:val="20"/>
-          <w:szCs w:val="20"/>
-          <w:shd w:val="clear" w:color="auto" w:fill="FFFFFF"/>
-        </w:rPr>
-        <w:t>and reprogram php database calls to use mysqli library</w:t>
+          <w:b/>
+          <w:bCs/>
+          <w:color w:val="000000"/>
+          <w:sz w:val="20"/>
+          <w:szCs w:val="20"/>
+          <w:shd w:val="clear" w:color="auto" w:fill="FFFFFF"/>
+        </w:rPr>
+        <w:t>SQL Injection Prevention:</w:t>
+      </w:r>
+      <w:r>
+        <w:rPr>
+          <w:rFonts w:ascii="Open Sans" w:hAnsi="Open Sans" w:cs="Open Sans"/>
+          <w:color w:val="000000"/>
+          <w:sz w:val="20"/>
+          <w:szCs w:val="20"/>
+          <w:shd w:val="clear" w:color="auto" w:fill="FFFFFF"/>
+        </w:rPr>
+        <w:t xml:space="preserve"> Replace all raw mysqli_query() calls with prepared statements using mysqli_prepare() and mysqli_bind_param().  </w:t>
       </w:r>
     </w:p>
     <w:p>
       <w:pPr>
-        <w:pStyle w:val="ListParagraph"/>
         <w:numPr>
           <w:ilvl w:val="0"/>
-          <w:numId w:val="4"/>
+          <w:numId w:val="5"/>
         </w:numPr>
         <w:rPr>
           <w:rFonts w:ascii="Open Sans" w:hAnsi="Open Sans" w:cs="Open Sans"/>
@@ -164,43 +282,102 @@
       <w:r>
         <w:rPr>
           <w:rFonts w:ascii="Open Sans" w:hAnsi="Open Sans" w:cs="Open Sans"/>
-          <w:color w:val="000000"/>
-          <w:sz w:val="20"/>
-          <w:szCs w:val="20"/>
-          <w:shd w:val="clear" w:color="auto" w:fill="FFFFFF"/>
-        </w:rPr>
-        <w:t>Configure pfSense and move CTF9 into the private subnet behind pfSense</w:t>
-      </w:r>
-      <w:r>
-        <w:rPr>
-          <w:rFonts w:ascii="Open Sans" w:hAnsi="Open Sans" w:cs="Open Sans"/>
-          <w:color w:val="000000"/>
-          <w:sz w:val="20"/>
-          <w:szCs w:val="20"/>
-          <w:shd w:val="clear" w:color="auto" w:fill="FFFFFF"/>
-        </w:rPr>
-        <w:t>.  Port forward all ports that CTF9 accepts through the firewall to CTF9.</w:t>
+          <w:b/>
+          <w:bCs/>
+          <w:color w:val="000000"/>
+          <w:sz w:val="20"/>
+          <w:szCs w:val="20"/>
+          <w:shd w:val="clear" w:color="auto" w:fill="FFFFFF"/>
+        </w:rPr>
+        <w:t>PHP and XSS Prevention:</w:t>
+      </w:r>
+      <w:r>
+        <w:rPr>
+          <w:rFonts w:ascii="Open Sans" w:hAnsi="Open Sans" w:cs="Open Sans"/>
+          <w:color w:val="000000"/>
+          <w:sz w:val="20"/>
+          <w:szCs w:val="20"/>
+          <w:shd w:val="clear" w:color="auto" w:fill="FFFFFF"/>
+        </w:rPr>
+        <w:t xml:space="preserve"> Sanitize all output using htmlspecialchars() or htmlentities() to prevent stored XSS</w:t>
       </w:r>
     </w:p>
     <w:p>
       <w:pPr>
-        <w:rPr>
-          <w:rFonts w:ascii="Open Sans" w:hAnsi="Open Sans" w:cs="Open Sans"/>
-          <w:color w:val="000000"/>
-          <w:sz w:val="20"/>
-          <w:szCs w:val="20"/>
-          <w:shd w:val="clear" w:color="auto" w:fill="FFFFFF"/>
-        </w:rPr>
-      </w:pPr>
-      <w:r>
-        <w:rPr>
-          <w:rFonts w:ascii="Open Sans" w:hAnsi="Open Sans" w:cs="Open Sans"/>
-          <w:color w:val="000000"/>
-          <w:sz w:val="20"/>
-          <w:szCs w:val="20"/>
-          <w:shd w:val="clear" w:color="auto" w:fill="FFFFFF"/>
-        </w:rPr>
-        <w:t>(Groups of 2 must do at least two of these things.)</w:t>
+        <w:numPr>
+          <w:ilvl w:val="0"/>
+          <w:numId w:val="5"/>
+        </w:numPr>
+        <w:rPr>
+          <w:rFonts w:ascii="Open Sans" w:hAnsi="Open Sans" w:cs="Open Sans"/>
+          <w:color w:val="000000"/>
+          <w:sz w:val="20"/>
+          <w:szCs w:val="20"/>
+          <w:shd w:val="clear" w:color="auto" w:fill="FFFFFF"/>
+        </w:rPr>
+      </w:pPr>
+      <w:r>
+        <w:rPr>
+          <w:rFonts w:ascii="Open Sans" w:hAnsi="Open Sans" w:cs="Open Sans"/>
+          <w:b/>
+          <w:bCs/>
+          <w:color w:val="000000"/>
+          <w:sz w:val="20"/>
+          <w:szCs w:val="20"/>
+          <w:shd w:val="clear" w:color="auto" w:fill="FFFFFF"/>
+        </w:rPr>
+        <w:t>Authentication and Permission:</w:t>
+      </w:r>
+      <w:r>
+        <w:rPr>
+          <w:rFonts w:ascii="Open Sans" w:hAnsi="Open Sans" w:cs="Open Sans"/>
+          <w:color w:val="000000"/>
+          <w:sz w:val="20"/>
+          <w:szCs w:val="20"/>
+          <w:shd w:val="clear" w:color="auto" w:fill="FFFFFF"/>
+        </w:rPr>
+        <w:t xml:space="preserve"> Strengthen authentication and passwords using PAM (Pluggable Authentication Modules) by installing libpam-pwquality to enforce system password complexity, change weak user passwords, and install fail2ban to prevent logins after a number of incorrect password attempts for console login, ssh login, and website login.</w:t>
+      </w:r>
+    </w:p>
+    <w:p>
+      <w:pPr>
+        <w:rPr>
+          <w:rFonts w:ascii="Open Sans" w:hAnsi="Open Sans" w:cs="Open Sans"/>
+          <w:color w:val="000000"/>
+          <w:sz w:val="20"/>
+          <w:szCs w:val="20"/>
+          <w:shd w:val="clear" w:color="auto" w:fill="FFFFFF"/>
+        </w:rPr>
+      </w:pPr>
+      <w:r>
+        <w:rPr>
+          <w:rFonts w:ascii="Open Sans" w:hAnsi="Open Sans" w:cs="Open Sans"/>
+          <w:color w:val="000000"/>
+          <w:sz w:val="20"/>
+          <w:szCs w:val="20"/>
+          <w:shd w:val="clear" w:color="auto" w:fill="FFFFFF"/>
+        </w:rPr>
+        <w:t>(Groups of 2 must do at least t</w:t>
+      </w:r>
+      <w:r>
+        <w:rPr>
+          <w:rFonts w:ascii="Open Sans" w:hAnsi="Open Sans" w:cs="Open Sans"/>
+          <w:color w:val="000000"/>
+          <w:sz w:val="20"/>
+          <w:szCs w:val="20"/>
+          <w:shd w:val="clear" w:color="auto" w:fill="FFFFFF"/>
+        </w:rPr>
+        <w:t>wo</w:t>
+      </w:r>
+      <w:r>
+        <w:rPr>
+          <w:rFonts w:ascii="Open Sans" w:hAnsi="Open Sans" w:cs="Open Sans"/>
+          <w:color w:val="000000"/>
+          <w:sz w:val="20"/>
+          <w:szCs w:val="20"/>
+          <w:shd w:val="clear" w:color="auto" w:fill="FFFFFF"/>
+        </w:rPr>
+        <w:t xml:space="preserve"> of these things.)</w:t>
       </w:r>
     </w:p>
     <w:p>
@@ -446,57 +623,17 @@
           <w:szCs w:val="20"/>
           <w:shd w:val="clear" w:color="auto" w:fill="FFFFFF"/>
         </w:rPr>
-        <w:t xml:space="preserve">Install a </w:t>
-      </w:r>
-      <w:r>
-        <w:rPr>
-          <w:rFonts w:ascii="Open Sans" w:hAnsi="Open Sans" w:cs="Open Sans"/>
-          <w:color w:val="000000"/>
-          <w:sz w:val="20"/>
-          <w:szCs w:val="20"/>
-          <w:shd w:val="clear" w:color="auto" w:fill="FFFFFF"/>
-        </w:rPr>
-        <w:t xml:space="preserve">light </w:t>
-      </w:r>
-      <w:r>
-        <w:rPr>
-          <w:rFonts w:ascii="Open Sans" w:hAnsi="Open Sans" w:cs="Open Sans"/>
-          <w:color w:val="000000"/>
-          <w:sz w:val="20"/>
-          <w:szCs w:val="20"/>
-          <w:shd w:val="clear" w:color="auto" w:fill="FFFFFF"/>
-        </w:rPr>
-        <w:t>local firewall</w:t>
-      </w:r>
-      <w:r>
-        <w:rPr>
-          <w:rFonts w:ascii="Open Sans" w:hAnsi="Open Sans" w:cs="Open Sans"/>
-          <w:color w:val="000000"/>
-          <w:sz w:val="20"/>
-          <w:szCs w:val="20"/>
-          <w:shd w:val="clear" w:color="auto" w:fill="FFFFFF"/>
-        </w:rPr>
-        <w:t xml:space="preserve"> like shorewall</w:t>
-      </w:r>
-      <w:r>
-        <w:rPr>
-          <w:rFonts w:ascii="Open Sans" w:hAnsi="Open Sans" w:cs="Open Sans"/>
-          <w:color w:val="000000"/>
-          <w:sz w:val="20"/>
-          <w:szCs w:val="20"/>
-          <w:shd w:val="clear" w:color="auto" w:fill="FFFFFF"/>
-        </w:rPr>
-        <w:t xml:space="preserve"> or UFW.  Configure it with reasonable rules.  Document those rules.</w:t>
-      </w:r>
-      <w:r>
-        <w:rPr>
-          <w:rFonts w:ascii="Open Sans" w:hAnsi="Open Sans" w:cs="Open Sans"/>
-          <w:color w:val="000000"/>
-          <w:sz w:val="20"/>
-          <w:szCs w:val="20"/>
-          <w:shd w:val="clear" w:color="auto" w:fill="FFFFFF"/>
-        </w:rPr>
-        <w:t xml:space="preserve"> [medium]</w:t>
+        <w:t xml:space="preserve">Any item from </w:t>
+      </w:r>
+      <w:r>
+        <w:rPr>
+          <w:rFonts w:ascii="Open Sans" w:hAnsi="Open Sans" w:cs="Open Sans"/>
+          <w:color w:val="000000"/>
+          <w:sz w:val="20"/>
+          <w:szCs w:val="20"/>
+          <w:shd w:val="clear" w:color="auto" w:fill="FFFFFF"/>
+        </w:rPr>
+        <w:t>the main hardening tasks above that you didn’t already complete counts as a [harder] task.</w:t>
       </w:r>
     </w:p>
     <w:p>
@@ -522,67 +659,37 @@
           <w:szCs w:val="20"/>
           <w:shd w:val="clear" w:color="auto" w:fill="FFFFFF"/>
         </w:rPr>
-        <w:t xml:space="preserve">Fix </w:t>
-      </w:r>
-      <w:r>
-        <w:rPr>
-          <w:rFonts w:ascii="Open Sans" w:hAnsi="Open Sans" w:cs="Open Sans"/>
-          <w:color w:val="000000"/>
-          <w:sz w:val="20"/>
-          <w:szCs w:val="20"/>
-          <w:shd w:val="clear" w:color="auto" w:fill="FFFFFF"/>
-        </w:rPr>
-        <w:t>and p</w:t>
-      </w:r>
-      <w:r>
-        <w:rPr>
-          <w:rFonts w:ascii="Open Sans" w:hAnsi="Open Sans" w:cs="Open Sans"/>
-          <w:color w:val="000000"/>
-          <w:sz w:val="20"/>
-          <w:szCs w:val="20"/>
-          <w:shd w:val="clear" w:color="auto" w:fill="FFFFFF"/>
-        </w:rPr>
-        <w:t xml:space="preserve">revent </w:t>
-      </w:r>
-      <w:r>
-        <w:rPr>
-          <w:rFonts w:ascii="Open Sans" w:hAnsi="Open Sans" w:cs="Open Sans"/>
-          <w:color w:val="000000"/>
-          <w:sz w:val="20"/>
-          <w:szCs w:val="20"/>
-          <w:shd w:val="clear" w:color="auto" w:fill="FFFFFF"/>
-        </w:rPr>
-        <w:t>XSS and SQL i</w:t>
-      </w:r>
-      <w:r>
-        <w:rPr>
-          <w:rFonts w:ascii="Open Sans" w:hAnsi="Open Sans" w:cs="Open Sans"/>
-          <w:color w:val="000000"/>
-          <w:sz w:val="20"/>
-          <w:szCs w:val="20"/>
-          <w:shd w:val="clear" w:color="auto" w:fill="FFFFFF"/>
-        </w:rPr>
-        <w:t>njection</w:t>
-      </w:r>
-      <w:r>
-        <w:rPr>
-          <w:rFonts w:ascii="Open Sans" w:hAnsi="Open Sans" w:cs="Open Sans"/>
-          <w:color w:val="000000"/>
-          <w:sz w:val="20"/>
-          <w:szCs w:val="20"/>
-          <w:shd w:val="clear" w:color="auto" w:fill="FFFFFF"/>
-        </w:rPr>
-        <w:t xml:space="preserve"> attacks (look in /var/www/html for php files)</w:t>
-      </w:r>
-      <w:r>
-        <w:rPr>
-          <w:rFonts w:ascii="Open Sans" w:hAnsi="Open Sans" w:cs="Open Sans"/>
-          <w:color w:val="000000"/>
-          <w:sz w:val="20"/>
-          <w:szCs w:val="20"/>
-          <w:shd w:val="clear" w:color="auto" w:fill="FFFFFF"/>
-        </w:rPr>
-        <w:t xml:space="preserve"> [harder]</w:t>
+        <w:t>Fix weak configurations</w:t>
+      </w:r>
+      <w:r>
+        <w:rPr>
+          <w:rFonts w:ascii="Open Sans" w:hAnsi="Open Sans" w:cs="Open Sans"/>
+          <w:color w:val="000000"/>
+          <w:sz w:val="20"/>
+          <w:szCs w:val="20"/>
+          <w:shd w:val="clear" w:color="auto" w:fill="FFFFFF"/>
+        </w:rPr>
+        <w:t xml:space="preserve">/harden </w:t>
+      </w:r>
+      <w:r>
+        <w:rPr>
+          <w:rFonts w:ascii="Open Sans" w:hAnsi="Open Sans" w:cs="Open Sans"/>
+          <w:color w:val="000000"/>
+          <w:sz w:val="20"/>
+          <w:szCs w:val="20"/>
+          <w:shd w:val="clear" w:color="auto" w:fill="FFFFFF"/>
+        </w:rPr>
+        <w:t>the ssh and apache configuration files</w:t>
+      </w:r>
+      <w:r>
+        <w:rPr>
+          <w:rFonts w:ascii="Open Sans" w:hAnsi="Open Sans" w:cs="Open Sans"/>
+          <w:color w:val="000000"/>
+          <w:sz w:val="20"/>
+          <w:szCs w:val="20"/>
+          <w:shd w:val="clear" w:color="auto" w:fill="FFFFFF"/>
+        </w:rPr>
+        <w:t xml:space="preserve"> [easier]</w:t>
       </w:r>
     </w:p>
     <w:p>
@@ -608,47 +715,7 @@
           <w:szCs w:val="20"/>
           <w:shd w:val="clear" w:color="auto" w:fill="FFFFFF"/>
         </w:rPr>
-        <w:t>Fix user and application p</w:t>
-      </w:r>
-      <w:r>
-        <w:rPr>
-          <w:rFonts w:ascii="Open Sans" w:hAnsi="Open Sans" w:cs="Open Sans"/>
-          <w:color w:val="000000"/>
-          <w:sz w:val="20"/>
-          <w:szCs w:val="20"/>
-          <w:shd w:val="clear" w:color="auto" w:fill="FFFFFF"/>
-        </w:rPr>
-        <w:t>ermissions</w:t>
-      </w:r>
-      <w:r>
-        <w:rPr>
-          <w:rFonts w:ascii="Open Sans" w:hAnsi="Open Sans" w:cs="Open Sans"/>
-          <w:color w:val="000000"/>
-          <w:sz w:val="20"/>
-          <w:szCs w:val="20"/>
-          <w:shd w:val="clear" w:color="auto" w:fill="FFFFFF"/>
-        </w:rPr>
-        <w:t>/s</w:t>
-      </w:r>
-      <w:r>
-        <w:rPr>
-          <w:rFonts w:ascii="Open Sans" w:hAnsi="Open Sans" w:cs="Open Sans"/>
-          <w:color w:val="000000"/>
-          <w:sz w:val="20"/>
-          <w:szCs w:val="20"/>
-          <w:shd w:val="clear" w:color="auto" w:fill="FFFFFF"/>
-        </w:rPr>
-        <w:t>ettings</w:t>
-      </w:r>
-      <w:r>
-        <w:rPr>
-          <w:rFonts w:ascii="Open Sans" w:hAnsi="Open Sans" w:cs="Open Sans"/>
-          <w:color w:val="000000"/>
-          <w:sz w:val="20"/>
-          <w:szCs w:val="20"/>
-          <w:shd w:val="clear" w:color="auto" w:fill="FFFFFF"/>
-        </w:rPr>
-        <w:t xml:space="preserve"> [easier]</w:t>
+        <w:t>Add two-factor authentication to either the system/ssh logins [easier], the web login [easier], or both [medium]</w:t>
       </w:r>
     </w:p>
     <w:p>
@@ -674,119 +741,57 @@
           <w:szCs w:val="20"/>
           <w:shd w:val="clear" w:color="auto" w:fill="FFFFFF"/>
         </w:rPr>
-        <w:t>Fix weak configurations</w:t>
-      </w:r>
-      <w:r>
-        <w:rPr>
-          <w:rFonts w:ascii="Open Sans" w:hAnsi="Open Sans" w:cs="Open Sans"/>
-          <w:color w:val="000000"/>
-          <w:sz w:val="20"/>
-          <w:szCs w:val="20"/>
-          <w:shd w:val="clear" w:color="auto" w:fill="FFFFFF"/>
-        </w:rPr>
-        <w:t>/harden services</w:t>
-      </w:r>
-      <w:r>
-        <w:rPr>
-          <w:rFonts w:ascii="Open Sans" w:hAnsi="Open Sans" w:cs="Open Sans"/>
-          <w:color w:val="000000"/>
-          <w:sz w:val="20"/>
-          <w:szCs w:val="20"/>
-          <w:shd w:val="clear" w:color="auto" w:fill="FFFFFF"/>
-        </w:rPr>
-        <w:t xml:space="preserve"> [easier]</w:t>
-      </w:r>
-    </w:p>
-    <w:p>
-      <w:pPr>
-        <w:pStyle w:val="ListParagraph"/>
-        <w:numPr>
-          <w:ilvl w:val="0"/>
-          <w:numId w:val="2"/>
-        </w:numPr>
-        <w:rPr>
-          <w:rFonts w:ascii="Open Sans" w:hAnsi="Open Sans" w:cs="Open Sans"/>
-          <w:color w:val="000000"/>
-          <w:sz w:val="20"/>
-          <w:szCs w:val="20"/>
-          <w:shd w:val="clear" w:color="auto" w:fill="FFFFFF"/>
-        </w:rPr>
-      </w:pPr>
-      <w:r>
-        <w:rPr>
-          <w:rFonts w:ascii="Open Sans" w:hAnsi="Open Sans" w:cs="Open Sans"/>
-          <w:color w:val="000000"/>
-          <w:sz w:val="20"/>
-          <w:szCs w:val="20"/>
-          <w:shd w:val="clear" w:color="auto" w:fill="FFFFFF"/>
-        </w:rPr>
-        <w:t>Lessen information leaked through banners, errors</w:t>
-      </w:r>
-      <w:r>
-        <w:rPr>
-          <w:rFonts w:ascii="Open Sans" w:hAnsi="Open Sans" w:cs="Open Sans"/>
-          <w:color w:val="000000"/>
-          <w:sz w:val="20"/>
-          <w:szCs w:val="20"/>
-          <w:shd w:val="clear" w:color="auto" w:fill="FFFFFF"/>
-        </w:rPr>
-        <w:t xml:space="preserve"> [easier]</w:t>
-      </w:r>
-    </w:p>
-    <w:p>
-      <w:pPr>
-        <w:pStyle w:val="ListParagraph"/>
-        <w:numPr>
-          <w:ilvl w:val="0"/>
-          <w:numId w:val="2"/>
-        </w:numPr>
-        <w:rPr>
-          <w:rFonts w:ascii="Open Sans" w:hAnsi="Open Sans" w:cs="Open Sans"/>
-          <w:color w:val="000000"/>
-          <w:sz w:val="20"/>
-          <w:szCs w:val="20"/>
-          <w:shd w:val="clear" w:color="auto" w:fill="FFFFFF"/>
-        </w:rPr>
-      </w:pPr>
-      <w:r>
-        <w:rPr>
-          <w:rFonts w:ascii="Open Sans" w:hAnsi="Open Sans" w:cs="Open Sans"/>
-          <w:color w:val="000000"/>
-          <w:sz w:val="20"/>
-          <w:szCs w:val="20"/>
-          <w:shd w:val="clear" w:color="auto" w:fill="FFFFFF"/>
-        </w:rPr>
-        <w:t>Strengthen authentication</w:t>
-      </w:r>
-      <w:r>
-        <w:rPr>
-          <w:rFonts w:ascii="Open Sans" w:hAnsi="Open Sans" w:cs="Open Sans"/>
-          <w:color w:val="000000"/>
-          <w:sz w:val="20"/>
-          <w:szCs w:val="20"/>
-          <w:shd w:val="clear" w:color="auto" w:fill="FFFFFF"/>
-        </w:rPr>
-        <w:t xml:space="preserve"> and passwords</w:t>
-      </w:r>
-      <w:r>
-        <w:rPr>
-          <w:rFonts w:ascii="Open Sans" w:hAnsi="Open Sans" w:cs="Open Sans"/>
-          <w:color w:val="000000"/>
-          <w:sz w:val="20"/>
-          <w:szCs w:val="20"/>
-          <w:shd w:val="clear" w:color="auto" w:fill="FFFFFF"/>
-        </w:rPr>
-        <w:t xml:space="preserve"> (look up PAM)</w:t>
-      </w:r>
-      <w:r>
-        <w:rPr>
-          <w:rFonts w:ascii="Open Sans" w:hAnsi="Open Sans" w:cs="Open Sans"/>
-          <w:color w:val="000000"/>
-          <w:sz w:val="20"/>
-          <w:szCs w:val="20"/>
-          <w:shd w:val="clear" w:color="auto" w:fill="FFFFFF"/>
-        </w:rPr>
-        <w:t xml:space="preserve"> [medium]</w:t>
+        <w:t>Lessen information leaked through banners</w:t>
+      </w:r>
+      <w:r>
+        <w:rPr>
+          <w:rFonts w:ascii="Open Sans" w:hAnsi="Open Sans" w:cs="Open Sans"/>
+          <w:color w:val="000000"/>
+          <w:sz w:val="20"/>
+          <w:szCs w:val="20"/>
+          <w:shd w:val="clear" w:color="auto" w:fill="FFFFFF"/>
+        </w:rPr>
+        <w:t xml:space="preserve"> and</w:t>
+      </w:r>
+      <w:r>
+        <w:rPr>
+          <w:rFonts w:ascii="Open Sans" w:hAnsi="Open Sans" w:cs="Open Sans"/>
+          <w:color w:val="000000"/>
+          <w:sz w:val="20"/>
+          <w:szCs w:val="20"/>
+          <w:shd w:val="clear" w:color="auto" w:fill="FFFFFF"/>
+        </w:rPr>
+        <w:t xml:space="preserve"> errors</w:t>
+      </w:r>
+      <w:r>
+        <w:rPr>
+          <w:rFonts w:ascii="Open Sans" w:hAnsi="Open Sans" w:cs="Open Sans"/>
+          <w:color w:val="000000"/>
+          <w:sz w:val="20"/>
+          <w:szCs w:val="20"/>
+          <w:shd w:val="clear" w:color="auto" w:fill="FFFFFF"/>
+        </w:rPr>
+        <w:t xml:space="preserve"> </w:t>
+      </w:r>
+      <w:r>
+        <w:rPr>
+          <w:rFonts w:ascii="Open Sans" w:hAnsi="Open Sans" w:cs="Open Sans"/>
+          <w:color w:val="000000"/>
+          <w:sz w:val="20"/>
+          <w:szCs w:val="20"/>
+          <w:shd w:val="clear" w:color="auto" w:fill="FFFFFF"/>
+        </w:rPr>
+        <w:t xml:space="preserve">for php, apache, and ssh </w:t>
+      </w:r>
+      <w:r>
+        <w:rPr>
+          <w:rFonts w:ascii="Open Sans" w:hAnsi="Open Sans" w:cs="Open Sans"/>
+          <w:color w:val="000000"/>
+          <w:sz w:val="20"/>
+          <w:szCs w:val="20"/>
+          <w:shd w:val="clear" w:color="auto" w:fill="FFFFFF"/>
+        </w:rPr>
+        <w:t>[easier]</w:t>
       </w:r>
     </w:p>
     <w:p>
@@ -812,7 +817,27 @@
           <w:szCs w:val="20"/>
           <w:shd w:val="clear" w:color="auto" w:fill="FFFFFF"/>
         </w:rPr>
-        <w:t>Install and configure Snort on PfSense along with rules that make sense for the firewall and server</w:t>
+        <w:t xml:space="preserve">Install and configure </w:t>
+      </w:r>
+      <w:r>
+        <w:rPr>
+          <w:rFonts w:ascii="Open Sans" w:hAnsi="Open Sans" w:cs="Open Sans"/>
+          <w:color w:val="000000"/>
+          <w:sz w:val="20"/>
+          <w:szCs w:val="20"/>
+          <w:shd w:val="clear" w:color="auto" w:fill="FFFFFF"/>
+        </w:rPr>
+        <w:t xml:space="preserve">an intrusion detection system (such as Snort) </w:t>
+      </w:r>
+      <w:r>
+        <w:rPr>
+          <w:rFonts w:ascii="Open Sans" w:hAnsi="Open Sans" w:cs="Open Sans"/>
+          <w:color w:val="000000"/>
+          <w:sz w:val="20"/>
+          <w:szCs w:val="20"/>
+          <w:shd w:val="clear" w:color="auto" w:fill="FFFFFF"/>
+        </w:rPr>
+        <w:t>along with rules that make sense for the server</w:t>
       </w:r>
       <w:r>
         <w:rPr>
@@ -868,7 +893,87 @@
           <w:szCs w:val="20"/>
           <w:shd w:val="clear" w:color="auto" w:fill="FFFFFF"/>
         </w:rPr>
+        <w:t>Convert the website from http to https [medium]</w:t>
+      </w:r>
+    </w:p>
+    <w:p>
+      <w:pPr>
+        <w:pStyle w:val="ListParagraph"/>
+        <w:numPr>
+          <w:ilvl w:val="0"/>
+          <w:numId w:val="3"/>
+        </w:numPr>
+        <w:rPr>
+          <w:rFonts w:ascii="Open Sans" w:hAnsi="Open Sans" w:cs="Open Sans"/>
+          <w:color w:val="000000"/>
+          <w:sz w:val="20"/>
+          <w:szCs w:val="20"/>
+          <w:shd w:val="clear" w:color="auto" w:fill="FFFFFF"/>
+        </w:rPr>
+      </w:pPr>
+      <w:r>
+        <w:rPr>
+          <w:rFonts w:ascii="Open Sans" w:hAnsi="Open Sans" w:cs="Open Sans"/>
+          <w:color w:val="000000"/>
+          <w:sz w:val="20"/>
+          <w:szCs w:val="20"/>
+          <w:shd w:val="clear" w:color="auto" w:fill="FFFFFF"/>
+        </w:rPr>
+        <w:lastRenderedPageBreak/>
+        <w:t>Hash passwords properly in the database by using a salt and make sure website authentication still works (see example project 1 template and presentation video on hashes) [medium]</w:t>
+      </w:r>
+    </w:p>
+    <w:p>
+      <w:pPr>
+        <w:pStyle w:val="ListParagraph"/>
+        <w:numPr>
+          <w:ilvl w:val="0"/>
+          <w:numId w:val="3"/>
+        </w:numPr>
+        <w:spacing w:after="0" w:line="240" w:lineRule="auto"/>
+        <w:contextualSpacing w:val="0"/>
+      </w:pPr>
+      <w:r>
+        <w:t>Implement Content Security Policy (CSP) HTTP header</w:t>
+      </w:r>
+      <w:r>
+        <w:t xml:space="preserve"> [easier]</w:t>
+      </w:r>
+    </w:p>
+    <w:p>
+      <w:pPr>
+        <w:pStyle w:val="ListParagraph"/>
+        <w:numPr>
+          <w:ilvl w:val="0"/>
+          <w:numId w:val="3"/>
+        </w:numPr>
+        <w:rPr>
+          <w:rFonts w:ascii="Open Sans" w:hAnsi="Open Sans" w:cs="Open Sans"/>
+          <w:color w:val="000000"/>
+          <w:sz w:val="20"/>
+          <w:szCs w:val="20"/>
+          <w:shd w:val="clear" w:color="auto" w:fill="FFFFFF"/>
+        </w:rPr>
+      </w:pPr>
+      <w:r>
+        <w:rPr>
+          <w:rFonts w:ascii="Open Sans" w:hAnsi="Open Sans" w:cs="Open Sans"/>
+          <w:color w:val="000000"/>
+          <w:sz w:val="20"/>
+          <w:szCs w:val="20"/>
+          <w:shd w:val="clear" w:color="auto" w:fill="FFFFFF"/>
+        </w:rPr>
         <w:t>Other things?</w:t>
+      </w:r>
+      <w:r>
+        <w:rPr>
+          <w:rFonts w:ascii="Open Sans" w:hAnsi="Open Sans" w:cs="Open Sans"/>
+          <w:color w:val="000000"/>
+          <w:sz w:val="20"/>
+          <w:szCs w:val="20"/>
+          <w:shd w:val="clear" w:color="auto" w:fill="FFFFFF"/>
+        </w:rPr>
+        <w:t xml:space="preserve">  Please ask the instructor to get the go-ahead and a rating.</w:t>
       </w:r>
     </w:p>
     <w:p>
@@ -1120,6 +1225,95 @@
     </w:lvl>
   </w:abstractNum>
   <w:abstractNum w:abstractNumId="2" w15:restartNumberingAfterBreak="0">
+    <w:nsid w:val="3871155F"/>
+    <w:multiLevelType w:val="hybridMultilevel"/>
+    <w:tmpl w:val="BCDE1AC0"/>
+    <w:lvl w:ilvl="0" w:tplc="0409000F">
+      <w:start w:val="1"/>
+      <w:numFmt w:val="decimal"/>
+      <w:lvlText w:val="%1."/>
+      <w:lvlJc w:val="left"/>
+      <w:pPr>
+        <w:ind w:left="720" w:hanging="360"/>
+      </w:pPr>
+      <w:rPr>
+        <w:rFonts w:hint="default"/>
+      </w:rPr>
+    </w:lvl>
+    <w:lvl w:ilvl="1" w:tplc="04090019" w:tentative="1">
+      <w:start w:val="1"/>
+      <w:numFmt w:val="lowerLetter"/>
+      <w:lvlText w:val="%2."/>
+      <w:lvlJc w:val="left"/>
+      <w:pPr>
+        <w:ind w:left="1440" w:hanging="360"/>
+      </w:pPr>
+    </w:lvl>
+    <w:lvl w:ilvl="2" w:tplc="0409001B" w:tentative="1">
+      <w:start w:val="1"/>
+      <w:numFmt w:val="lowerRoman"/>
+      <w:lvlText w:val="%3."/>
+      <w:lvlJc w:val="right"/>
+      <w:pPr>
+        <w:ind w:left="2160" w:hanging="180"/>
+      </w:pPr>
+    </w:lvl>
+    <w:lvl w:ilvl="3" w:tplc="0409000F" w:tentative="1">
+      <w:start w:val="1"/>
+      <w:numFmt w:val="decimal"/>
+      <w:lvlText w:val="%4."/>
+      <w:lvlJc w:val="left"/>
+      <w:pPr>
+        <w:ind w:left="2880" w:hanging="360"/>
+      </w:pPr>
+    </w:lvl>
+    <w:lvl w:ilvl="4" w:tplc="04090019" w:tentative="1">
+      <w:start w:val="1"/>
+      <w:numFmt w:val="lowerLetter"/>
+      <w:lvlText w:val="%5."/>
+      <w:lvlJc w:val="left"/>
+      <w:pPr>
+        <w:ind w:left="3600" w:hanging="360"/>
+      </w:pPr>
+    </w:lvl>
+    <w:lvl w:ilvl="5" w:tplc="0409001B" w:tentative="1">
+      <w:start w:val="1"/>
+      <w:numFmt w:val="lowerRoman"/>
+      <w:lvlText w:val="%6."/>
+      <w:lvlJc w:val="right"/>
+      <w:pPr>
+        <w:ind w:left="4320" w:hanging="180"/>
+      </w:pPr>
+    </w:lvl>
+    <w:lvl w:ilvl="6" w:tplc="0409000F" w:tentative="1">
+      <w:start w:val="1"/>
+      <w:numFmt w:val="decimal"/>
+      <w:lvlText w:val="%7."/>
+      <w:lvlJc w:val="left"/>
+      <w:pPr>
+        <w:ind w:left="5040" w:hanging="360"/>
+      </w:pPr>
+    </w:lvl>
+    <w:lvl w:ilvl="7" w:tplc="04090019" w:tentative="1">
+      <w:start w:val="1"/>
+      <w:numFmt w:val="lowerLetter"/>
+      <w:lvlText w:val="%8."/>
+      <w:lvlJc w:val="left"/>
+      <w:pPr>
+        <w:ind w:left="5760" w:hanging="360"/>
+      </w:pPr>
+    </w:lvl>
+    <w:lvl w:ilvl="8" w:tplc="0409001B" w:tentative="1">
+      <w:start w:val="1"/>
+      <w:numFmt w:val="lowerRoman"/>
+      <w:lvlText w:val="%9."/>
+      <w:lvlJc w:val="right"/>
+      <w:pPr>
+        <w:ind w:left="6480" w:hanging="180"/>
+      </w:pPr>
+    </w:lvl>
+  </w:abstractNum>
+  <w:abstractNum w:abstractNumId="3" w15:restartNumberingAfterBreak="0">
     <w:nsid w:val="4BF06B1E"/>
     <w:multiLevelType w:val="hybridMultilevel"/>
     <w:tmpl w:val="5638F622"/>
@@ -1232,7 +1426,61 @@
       </w:rPr>
     </w:lvl>
   </w:abstractNum>
-  <w:abstractNum w:abstractNumId="3" w15:restartNumberingAfterBreak="0">
+  <w:abstractNum w:abstractNumId="4" w15:restartNumberingAfterBreak="0">
+    <w:nsid w:val="5D7F1774"/>
+    <w:multiLevelType w:val="hybridMultilevel"/>
+    <w:tmpl w:val="DA6ACA94"/>
+    <w:lvl w:ilvl="0" w:tplc="1C80C908">
+      <w:start w:val="1"/>
+      <w:numFmt w:val="bullet"/>
+      <w:lvlText w:val="□"/>
+      <w:lvlJc w:val="left"/>
+      <w:pPr>
+        <w:ind w:left="720" w:hanging="360"/>
+      </w:pPr>
+    </w:lvl>
+    <w:lvl w:ilvl="1" w:tplc="F6A824D6">
+      <w:numFmt w:val="decimal"/>
+      <w:lvlText w:val=""/>
+      <w:lvlJc w:val="left"/>
+    </w:lvl>
+    <w:lvl w:ilvl="2" w:tplc="944A891A">
+      <w:numFmt w:val="decimal"/>
+      <w:lvlText w:val=""/>
+      <w:lvlJc w:val="left"/>
+    </w:lvl>
+    <w:lvl w:ilvl="3" w:tplc="34841586">
+      <w:numFmt w:val="decimal"/>
+      <w:lvlText w:val=""/>
+      <w:lvlJc w:val="left"/>
+    </w:lvl>
+    <w:lvl w:ilvl="4" w:tplc="220C7BE8">
+      <w:numFmt w:val="decimal"/>
+      <w:lvlText w:val=""/>
+      <w:lvlJc w:val="left"/>
+    </w:lvl>
+    <w:lvl w:ilvl="5" w:tplc="00FE50CC">
+      <w:numFmt w:val="decimal"/>
+      <w:lvlText w:val=""/>
+      <w:lvlJc w:val="left"/>
+    </w:lvl>
+    <w:lvl w:ilvl="6" w:tplc="16E219E4">
+      <w:numFmt w:val="decimal"/>
+      <w:lvlText w:val=""/>
+      <w:lvlJc w:val="left"/>
+    </w:lvl>
+    <w:lvl w:ilvl="7" w:tplc="C682E12A">
+      <w:numFmt w:val="decimal"/>
+      <w:lvlText w:val=""/>
+      <w:lvlJc w:val="left"/>
+    </w:lvl>
+    <w:lvl w:ilvl="8" w:tplc="B39E6CE6">
+      <w:numFmt w:val="decimal"/>
+      <w:lvlText w:val=""/>
+      <w:lvlJc w:val="left"/>
+    </w:lvl>
+  </w:abstractNum>
+  <w:abstractNum w:abstractNumId="5" w15:restartNumberingAfterBreak="0">
     <w:nsid w:val="677416DF"/>
     <w:multiLevelType w:val="hybridMultilevel"/>
     <w:tmpl w:val="16E83C60"/>
@@ -1349,13 +1597,22 @@
     <w:abstractNumId w:val="0"/>
   </w:num>
   <w:num w:numId="2" w16cid:durableId="1864585785">
-    <w:abstractNumId w:val="2"/>
+    <w:abstractNumId w:val="3"/>
   </w:num>
   <w:num w:numId="3" w16cid:durableId="2012440950">
-    <w:abstractNumId w:val="3"/>
+    <w:abstractNumId w:val="5"/>
   </w:num>
   <w:num w:numId="4" w16cid:durableId="240220212">
     <w:abstractNumId w:val="1"/>
+  </w:num>
+  <w:num w:numId="5" w16cid:durableId="928075174">
+    <w:abstractNumId w:val="2"/>
+  </w:num>
+  <w:num w:numId="6" w16cid:durableId="128672018">
+    <w:abstractNumId w:val="4"/>
+    <w:lvlOverride w:ilvl="0">
+      <w:startOverride w:val="1"/>
+    </w:lvlOverride>
   </w:num>
 </w:numbering>
 </file>
@@ -1557,7 +1814,7 @@
     <w:lsdException w:name="Medium Shading 2 Accent 1" w:uiPriority="64"/>
     <w:lsdException w:name="Medium List 1 Accent 1" w:uiPriority="65"/>
     <w:lsdException w:name="Revision" w:semiHidden="1"/>
-    <w:lsdException w:name="List Paragraph" w:uiPriority="34" w:qFormat="1"/>
+    <w:lsdException w:name="List Paragraph" w:uiPriority="0" w:qFormat="1"/>
     <w:lsdException w:name="Quote" w:uiPriority="29" w:qFormat="1"/>
     <w:lsdException w:name="Intense Quote" w:uiPriority="30" w:qFormat="1"/>
     <w:lsdException w:name="Medium List 2 Accent 1" w:uiPriority="66"/>
@@ -1762,7 +2019,6 @@
   <w:style w:type="character" w:default="1" w:styleId="DefaultParagraphFont">
     <w:name w:val="Default Paragraph Font"/>
     <w:uiPriority w:val="1"/>
-    <w:semiHidden/>
     <w:unhideWhenUsed/>
   </w:style>
   <w:style w:type="table" w:default="1" w:styleId="TableNormal">
@@ -1789,7 +2045,6 @@
   <w:style w:type="paragraph" w:styleId="ListParagraph">
     <w:name w:val="List Paragraph"/>
     <w:basedOn w:val="Normal"/>
-    <w:uiPriority w:val="34"/>
     <w:qFormat/>
     <w:rsid w:val="0087171D"/>
     <w:pPr>

</xml_diff>